<commit_message>
thesis: populate Glossary with 53 real entries
Replaces the [TODO] placeholder in the Glossary section with a real
two-column term/definition table covering all acronyms and technical
abbreviations actually referenced by the Pulsefy thesis (API, BPM, CC,
CRUD, ERD, JWT, MIR, MoSCoW, NLP, ORM, REST, SPA, TTS, UC, UML, etc.).

Co-Authored-By: Claude Opus 4.7 <noreply@anthropic.com>
</commit_message>
<xml_diff>
--- a/docs/Pulsefy_Diploma_Thesis.docx
+++ b/docs/Pulsefy_Diploma_Thesis.docx
@@ -6820,18 +6820,1566 @@
     </w:p>
     <w:p>
       <w:pPr>
-        <w:spacing w:after="120"/>
-        <w:jc w:val="left"/>
-      </w:pPr>
-      <w:r>
-        <w:rPr>
-          <w:i/>
-          <w:color w:val="C0392B"/>
-          <w:sz w:val="20"/>
-        </w:rPr>
-        <w:t>[TODO: two-column term/definition table with 35-45 abbreviation expansions]</w:t>
-      </w:r>
-    </w:p>
+        <w:spacing w:after="240"/>
+        <w:jc w:val="both"/>
+      </w:pPr>
+      <w:r>
+        <w:rPr>
+          <w:b w:val="0"/>
+          <w:i w:val="0"/>
+          <w:sz w:val="22"/>
+        </w:rPr>
+        <w:t>The terms below are abbreviations and technical concepts referenced in this paper. Proper nouns (such as MusicGen, Jamendo, Pollinations.ai) are not listed here.</w:t>
+      </w:r>
+    </w:p>
+    <w:tbl>
+      <w:tblPr>
+        <w:tblW w:type="auto" w:w="0"/>
+        <w:tblLayout w:type="fixed"/>
+        <w:tblLook w:firstColumn="1" w:firstRow="1" w:lastColumn="0" w:lastRow="0" w:noHBand="0" w:noVBand="1" w:val="04A0"/>
+      </w:tblPr>
+      <w:tblGrid>
+        <w:gridCol w:w="4703"/>
+        <w:gridCol w:w="4703"/>
+      </w:tblGrid>
+      <w:tr>
+        <w:tc>
+          <w:tcPr>
+            <w:tcW w:type="dxa" w:w="1984"/>
+          </w:tcPr>
+          <w:p>
+            <w:r>
+              <w:rPr>
+                <w:b/>
+                <w:sz w:val="22"/>
+              </w:rPr>
+              <w:t>API</w:t>
+            </w:r>
+          </w:p>
+        </w:tc>
+        <w:tc>
+          <w:tcPr>
+            <w:tcW w:type="dxa" w:w="7370"/>
+          </w:tcPr>
+          <w:p>
+            <w:r>
+              <w:rPr>
+                <w:sz w:val="22"/>
+              </w:rPr>
+              <w:t>Application Programming Interface</w:t>
+            </w:r>
+          </w:p>
+        </w:tc>
+      </w:tr>
+      <w:tr>
+        <w:tc>
+          <w:tcPr>
+            <w:tcW w:type="dxa" w:w="1984"/>
+          </w:tcPr>
+          <w:p>
+            <w:r>
+              <w:rPr>
+                <w:b/>
+                <w:sz w:val="22"/>
+              </w:rPr>
+              <w:t>BPM</w:t>
+            </w:r>
+          </w:p>
+        </w:tc>
+        <w:tc>
+          <w:tcPr>
+            <w:tcW w:type="dxa" w:w="7370"/>
+          </w:tcPr>
+          <w:p>
+            <w:r>
+              <w:rPr>
+                <w:sz w:val="22"/>
+              </w:rPr>
+              <w:t>Beats Per Minute</w:t>
+            </w:r>
+          </w:p>
+        </w:tc>
+      </w:tr>
+      <w:tr>
+        <w:tc>
+          <w:tcPr>
+            <w:tcW w:type="dxa" w:w="1984"/>
+          </w:tcPr>
+          <w:p>
+            <w:r>
+              <w:rPr>
+                <w:b/>
+                <w:sz w:val="22"/>
+              </w:rPr>
+              <w:t>CC</w:t>
+            </w:r>
+          </w:p>
+        </w:tc>
+        <w:tc>
+          <w:tcPr>
+            <w:tcW w:type="dxa" w:w="7370"/>
+          </w:tcPr>
+          <w:p>
+            <w:r>
+              <w:rPr>
+                <w:sz w:val="22"/>
+              </w:rPr>
+              <w:t>Creative Commons (license family used by the Jamendo catalog)</w:t>
+            </w:r>
+          </w:p>
+        </w:tc>
+      </w:tr>
+      <w:tr>
+        <w:tc>
+          <w:tcPr>
+            <w:tcW w:type="dxa" w:w="1984"/>
+          </w:tcPr>
+          <w:p>
+            <w:r>
+              <w:rPr>
+                <w:b/>
+                <w:sz w:val="22"/>
+              </w:rPr>
+              <w:t>CDN</w:t>
+            </w:r>
+          </w:p>
+        </w:tc>
+        <w:tc>
+          <w:tcPr>
+            <w:tcW w:type="dxa" w:w="7370"/>
+          </w:tcPr>
+          <w:p>
+            <w:r>
+              <w:rPr>
+                <w:sz w:val="22"/>
+              </w:rPr>
+              <w:t>Content Delivery Network</w:t>
+            </w:r>
+          </w:p>
+        </w:tc>
+      </w:tr>
+      <w:tr>
+        <w:tc>
+          <w:tcPr>
+            <w:tcW w:type="dxa" w:w="1984"/>
+          </w:tcPr>
+          <w:p>
+            <w:r>
+              <w:rPr>
+                <w:b/>
+                <w:sz w:val="22"/>
+              </w:rPr>
+              <w:t>CLI</w:t>
+            </w:r>
+          </w:p>
+        </w:tc>
+        <w:tc>
+          <w:tcPr>
+            <w:tcW w:type="dxa" w:w="7370"/>
+          </w:tcPr>
+          <w:p>
+            <w:r>
+              <w:rPr>
+                <w:sz w:val="22"/>
+              </w:rPr>
+              <w:t>Command Line Interface</w:t>
+            </w:r>
+          </w:p>
+        </w:tc>
+      </w:tr>
+      <w:tr>
+        <w:tc>
+          <w:tcPr>
+            <w:tcW w:type="dxa" w:w="1984"/>
+          </w:tcPr>
+          <w:p>
+            <w:r>
+              <w:rPr>
+                <w:b/>
+                <w:sz w:val="22"/>
+              </w:rPr>
+              <w:t>CPU</w:t>
+            </w:r>
+          </w:p>
+        </w:tc>
+        <w:tc>
+          <w:tcPr>
+            <w:tcW w:type="dxa" w:w="7370"/>
+          </w:tcPr>
+          <w:p>
+            <w:r>
+              <w:rPr>
+                <w:sz w:val="22"/>
+              </w:rPr>
+              <w:t>Central Processing Unit</w:t>
+            </w:r>
+          </w:p>
+        </w:tc>
+      </w:tr>
+      <w:tr>
+        <w:tc>
+          <w:tcPr>
+            <w:tcW w:type="dxa" w:w="1984"/>
+          </w:tcPr>
+          <w:p>
+            <w:r>
+              <w:rPr>
+                <w:b/>
+                <w:sz w:val="22"/>
+              </w:rPr>
+              <w:t>CRUD</w:t>
+            </w:r>
+          </w:p>
+        </w:tc>
+        <w:tc>
+          <w:tcPr>
+            <w:tcW w:type="dxa" w:w="7370"/>
+          </w:tcPr>
+          <w:p>
+            <w:r>
+              <w:rPr>
+                <w:sz w:val="22"/>
+              </w:rPr>
+              <w:t>Create, Read, Update, Delete</w:t>
+            </w:r>
+          </w:p>
+        </w:tc>
+      </w:tr>
+      <w:tr>
+        <w:tc>
+          <w:tcPr>
+            <w:tcW w:type="dxa" w:w="1984"/>
+          </w:tcPr>
+          <w:p>
+            <w:r>
+              <w:rPr>
+                <w:b/>
+                <w:sz w:val="22"/>
+              </w:rPr>
+              <w:t>CSS</w:t>
+            </w:r>
+          </w:p>
+        </w:tc>
+        <w:tc>
+          <w:tcPr>
+            <w:tcW w:type="dxa" w:w="7370"/>
+          </w:tcPr>
+          <w:p>
+            <w:r>
+              <w:rPr>
+                <w:sz w:val="22"/>
+              </w:rPr>
+              <w:t>Cascading Style Sheets</w:t>
+            </w:r>
+          </w:p>
+        </w:tc>
+      </w:tr>
+      <w:tr>
+        <w:tc>
+          <w:tcPr>
+            <w:tcW w:type="dxa" w:w="1984"/>
+          </w:tcPr>
+          <w:p>
+            <w:r>
+              <w:rPr>
+                <w:b/>
+                <w:sz w:val="22"/>
+              </w:rPr>
+              <w:t>CSV</w:t>
+            </w:r>
+          </w:p>
+        </w:tc>
+        <w:tc>
+          <w:tcPr>
+            <w:tcW w:type="dxa" w:w="7370"/>
+          </w:tcPr>
+          <w:p>
+            <w:r>
+              <w:rPr>
+                <w:sz w:val="22"/>
+              </w:rPr>
+              <w:t>Comma-Separated Values</w:t>
+            </w:r>
+          </w:p>
+        </w:tc>
+      </w:tr>
+      <w:tr>
+        <w:tc>
+          <w:tcPr>
+            <w:tcW w:type="dxa" w:w="1984"/>
+          </w:tcPr>
+          <w:p>
+            <w:r>
+              <w:rPr>
+                <w:b/>
+                <w:sz w:val="22"/>
+              </w:rPr>
+              <w:t>DAW</w:t>
+            </w:r>
+          </w:p>
+        </w:tc>
+        <w:tc>
+          <w:tcPr>
+            <w:tcW w:type="dxa" w:w="7370"/>
+          </w:tcPr>
+          <w:p>
+            <w:r>
+              <w:rPr>
+                <w:sz w:val="22"/>
+              </w:rPr>
+              <w:t>Digital Audio Workstation</w:t>
+            </w:r>
+          </w:p>
+        </w:tc>
+      </w:tr>
+      <w:tr>
+        <w:tc>
+          <w:tcPr>
+            <w:tcW w:type="dxa" w:w="1984"/>
+          </w:tcPr>
+          <w:p>
+            <w:r>
+              <w:rPr>
+                <w:b/>
+                <w:sz w:val="22"/>
+              </w:rPr>
+              <w:t>ERD</w:t>
+            </w:r>
+          </w:p>
+        </w:tc>
+        <w:tc>
+          <w:tcPr>
+            <w:tcW w:type="dxa" w:w="7370"/>
+          </w:tcPr>
+          <w:p>
+            <w:r>
+              <w:rPr>
+                <w:sz w:val="22"/>
+              </w:rPr>
+              <w:t>Entity-Relationship Diagram</w:t>
+            </w:r>
+          </w:p>
+        </w:tc>
+      </w:tr>
+      <w:tr>
+        <w:tc>
+          <w:tcPr>
+            <w:tcW w:type="dxa" w:w="1984"/>
+          </w:tcPr>
+          <w:p>
+            <w:r>
+              <w:rPr>
+                <w:b/>
+                <w:sz w:val="22"/>
+              </w:rPr>
+              <w:t>FK</w:t>
+            </w:r>
+          </w:p>
+        </w:tc>
+        <w:tc>
+          <w:tcPr>
+            <w:tcW w:type="dxa" w:w="7370"/>
+          </w:tcPr>
+          <w:p>
+            <w:r>
+              <w:rPr>
+                <w:sz w:val="22"/>
+              </w:rPr>
+              <w:t>Foreign Key</w:t>
+            </w:r>
+          </w:p>
+        </w:tc>
+      </w:tr>
+      <w:tr>
+        <w:tc>
+          <w:tcPr>
+            <w:tcW w:type="dxa" w:w="1984"/>
+          </w:tcPr>
+          <w:p>
+            <w:r>
+              <w:rPr>
+                <w:b/>
+                <w:sz w:val="22"/>
+              </w:rPr>
+              <w:t>GB</w:t>
+            </w:r>
+          </w:p>
+        </w:tc>
+        <w:tc>
+          <w:tcPr>
+            <w:tcW w:type="dxa" w:w="7370"/>
+          </w:tcPr>
+          <w:p>
+            <w:r>
+              <w:rPr>
+                <w:sz w:val="22"/>
+              </w:rPr>
+              <w:t>Gigabyte</w:t>
+            </w:r>
+          </w:p>
+        </w:tc>
+      </w:tr>
+      <w:tr>
+        <w:tc>
+          <w:tcPr>
+            <w:tcW w:type="dxa" w:w="1984"/>
+          </w:tcPr>
+          <w:p>
+            <w:r>
+              <w:rPr>
+                <w:b/>
+                <w:sz w:val="22"/>
+              </w:rPr>
+              <w:t>GPU</w:t>
+            </w:r>
+          </w:p>
+        </w:tc>
+        <w:tc>
+          <w:tcPr>
+            <w:tcW w:type="dxa" w:w="7370"/>
+          </w:tcPr>
+          <w:p>
+            <w:r>
+              <w:rPr>
+                <w:sz w:val="22"/>
+              </w:rPr>
+              <w:t>Graphics Processing Unit</w:t>
+            </w:r>
+          </w:p>
+        </w:tc>
+      </w:tr>
+      <w:tr>
+        <w:tc>
+          <w:tcPr>
+            <w:tcW w:type="dxa" w:w="1984"/>
+          </w:tcPr>
+          <w:p>
+            <w:r>
+              <w:rPr>
+                <w:b/>
+                <w:sz w:val="22"/>
+              </w:rPr>
+              <w:t>HTML</w:t>
+            </w:r>
+          </w:p>
+        </w:tc>
+        <w:tc>
+          <w:tcPr>
+            <w:tcW w:type="dxa" w:w="7370"/>
+          </w:tcPr>
+          <w:p>
+            <w:r>
+              <w:rPr>
+                <w:sz w:val="22"/>
+              </w:rPr>
+              <w:t>HyperText Markup Language</w:t>
+            </w:r>
+          </w:p>
+        </w:tc>
+      </w:tr>
+      <w:tr>
+        <w:tc>
+          <w:tcPr>
+            <w:tcW w:type="dxa" w:w="1984"/>
+          </w:tcPr>
+          <w:p>
+            <w:r>
+              <w:rPr>
+                <w:b/>
+                <w:sz w:val="22"/>
+              </w:rPr>
+              <w:t>HTTP</w:t>
+            </w:r>
+          </w:p>
+        </w:tc>
+        <w:tc>
+          <w:tcPr>
+            <w:tcW w:type="dxa" w:w="7370"/>
+          </w:tcPr>
+          <w:p>
+            <w:r>
+              <w:rPr>
+                <w:sz w:val="22"/>
+              </w:rPr>
+              <w:t>HyperText Transfer Protocol</w:t>
+            </w:r>
+          </w:p>
+        </w:tc>
+      </w:tr>
+      <w:tr>
+        <w:tc>
+          <w:tcPr>
+            <w:tcW w:type="dxa" w:w="1984"/>
+          </w:tcPr>
+          <w:p>
+            <w:r>
+              <w:rPr>
+                <w:b/>
+                <w:sz w:val="22"/>
+              </w:rPr>
+              <w:t>HTTPS</w:t>
+            </w:r>
+          </w:p>
+        </w:tc>
+        <w:tc>
+          <w:tcPr>
+            <w:tcW w:type="dxa" w:w="7370"/>
+          </w:tcPr>
+          <w:p>
+            <w:r>
+              <w:rPr>
+                <w:sz w:val="22"/>
+              </w:rPr>
+              <w:t>HyperText Transfer Protocol Secure</w:t>
+            </w:r>
+          </w:p>
+        </w:tc>
+      </w:tr>
+      <w:tr>
+        <w:tc>
+          <w:tcPr>
+            <w:tcW w:type="dxa" w:w="1984"/>
+          </w:tcPr>
+          <w:p>
+            <w:r>
+              <w:rPr>
+                <w:b/>
+                <w:sz w:val="22"/>
+              </w:rPr>
+              <w:t>IDE</w:t>
+            </w:r>
+          </w:p>
+        </w:tc>
+        <w:tc>
+          <w:tcPr>
+            <w:tcW w:type="dxa" w:w="7370"/>
+          </w:tcPr>
+          <w:p>
+            <w:r>
+              <w:rPr>
+                <w:sz w:val="22"/>
+              </w:rPr>
+              <w:t>Integrated Development Environment</w:t>
+            </w:r>
+          </w:p>
+        </w:tc>
+      </w:tr>
+      <w:tr>
+        <w:tc>
+          <w:tcPr>
+            <w:tcW w:type="dxa" w:w="1984"/>
+          </w:tcPr>
+          <w:p>
+            <w:r>
+              <w:rPr>
+                <w:b/>
+                <w:sz w:val="22"/>
+              </w:rPr>
+              <w:t>JS</w:t>
+            </w:r>
+          </w:p>
+        </w:tc>
+        <w:tc>
+          <w:tcPr>
+            <w:tcW w:type="dxa" w:w="7370"/>
+          </w:tcPr>
+          <w:p>
+            <w:r>
+              <w:rPr>
+                <w:sz w:val="22"/>
+              </w:rPr>
+              <w:t>JavaScript</w:t>
+            </w:r>
+          </w:p>
+        </w:tc>
+      </w:tr>
+      <w:tr>
+        <w:tc>
+          <w:tcPr>
+            <w:tcW w:type="dxa" w:w="1984"/>
+          </w:tcPr>
+          <w:p>
+            <w:r>
+              <w:rPr>
+                <w:b/>
+                <w:sz w:val="22"/>
+              </w:rPr>
+              <w:t>JSON</w:t>
+            </w:r>
+          </w:p>
+        </w:tc>
+        <w:tc>
+          <w:tcPr>
+            <w:tcW w:type="dxa" w:w="7370"/>
+          </w:tcPr>
+          <w:p>
+            <w:r>
+              <w:rPr>
+                <w:sz w:val="22"/>
+              </w:rPr>
+              <w:t>JavaScript Object Notation</w:t>
+            </w:r>
+          </w:p>
+        </w:tc>
+      </w:tr>
+      <w:tr>
+        <w:tc>
+          <w:tcPr>
+            <w:tcW w:type="dxa" w:w="1984"/>
+          </w:tcPr>
+          <w:p>
+            <w:r>
+              <w:rPr>
+                <w:b/>
+                <w:sz w:val="22"/>
+              </w:rPr>
+              <w:t>JWT</w:t>
+            </w:r>
+          </w:p>
+        </w:tc>
+        <w:tc>
+          <w:tcPr>
+            <w:tcW w:type="dxa" w:w="7370"/>
+          </w:tcPr>
+          <w:p>
+            <w:r>
+              <w:rPr>
+                <w:sz w:val="22"/>
+              </w:rPr>
+              <w:t>JSON Web Token</w:t>
+            </w:r>
+          </w:p>
+        </w:tc>
+      </w:tr>
+      <w:tr>
+        <w:tc>
+          <w:tcPr>
+            <w:tcW w:type="dxa" w:w="1984"/>
+          </w:tcPr>
+          <w:p>
+            <w:r>
+              <w:rPr>
+                <w:b/>
+                <w:sz w:val="22"/>
+              </w:rPr>
+              <w:t>LLM</w:t>
+            </w:r>
+          </w:p>
+        </w:tc>
+        <w:tc>
+          <w:tcPr>
+            <w:tcW w:type="dxa" w:w="7370"/>
+          </w:tcPr>
+          <w:p>
+            <w:r>
+              <w:rPr>
+                <w:sz w:val="22"/>
+              </w:rPr>
+              <w:t>Large Language Model</w:t>
+            </w:r>
+          </w:p>
+        </w:tc>
+      </w:tr>
+      <w:tr>
+        <w:tc>
+          <w:tcPr>
+            <w:tcW w:type="dxa" w:w="1984"/>
+          </w:tcPr>
+          <w:p>
+            <w:r>
+              <w:rPr>
+                <w:b/>
+                <w:sz w:val="22"/>
+              </w:rPr>
+              <w:t>MAU</w:t>
+            </w:r>
+          </w:p>
+        </w:tc>
+        <w:tc>
+          <w:tcPr>
+            <w:tcW w:type="dxa" w:w="7370"/>
+          </w:tcPr>
+          <w:p>
+            <w:r>
+              <w:rPr>
+                <w:sz w:val="22"/>
+              </w:rPr>
+              <w:t>Monthly Active Users</w:t>
+            </w:r>
+          </w:p>
+        </w:tc>
+      </w:tr>
+      <w:tr>
+        <w:tc>
+          <w:tcPr>
+            <w:tcW w:type="dxa" w:w="1984"/>
+          </w:tcPr>
+          <w:p>
+            <w:r>
+              <w:rPr>
+                <w:b/>
+                <w:sz w:val="22"/>
+              </w:rPr>
+              <w:t>MB</w:t>
+            </w:r>
+          </w:p>
+        </w:tc>
+        <w:tc>
+          <w:tcPr>
+            <w:tcW w:type="dxa" w:w="7370"/>
+          </w:tcPr>
+          <w:p>
+            <w:r>
+              <w:rPr>
+                <w:sz w:val="22"/>
+              </w:rPr>
+              <w:t>Megabyte</w:t>
+            </w:r>
+          </w:p>
+        </w:tc>
+      </w:tr>
+      <w:tr>
+        <w:tc>
+          <w:tcPr>
+            <w:tcW w:type="dxa" w:w="1984"/>
+          </w:tcPr>
+          <w:p>
+            <w:r>
+              <w:rPr>
+                <w:b/>
+                <w:sz w:val="22"/>
+              </w:rPr>
+              <w:t>MIR</w:t>
+            </w:r>
+          </w:p>
+        </w:tc>
+        <w:tc>
+          <w:tcPr>
+            <w:tcW w:type="dxa" w:w="7370"/>
+          </w:tcPr>
+          <w:p>
+            <w:r>
+              <w:rPr>
+                <w:sz w:val="22"/>
+              </w:rPr>
+              <w:t>Music Information Retrieval</w:t>
+            </w:r>
+          </w:p>
+        </w:tc>
+      </w:tr>
+      <w:tr>
+        <w:tc>
+          <w:tcPr>
+            <w:tcW w:type="dxa" w:w="1984"/>
+          </w:tcPr>
+          <w:p>
+            <w:r>
+              <w:rPr>
+                <w:b/>
+                <w:sz w:val="22"/>
+              </w:rPr>
+              <w:t>ML</w:t>
+            </w:r>
+          </w:p>
+        </w:tc>
+        <w:tc>
+          <w:tcPr>
+            <w:tcW w:type="dxa" w:w="7370"/>
+          </w:tcPr>
+          <w:p>
+            <w:r>
+              <w:rPr>
+                <w:sz w:val="22"/>
+              </w:rPr>
+              <w:t>Machine Learning</w:t>
+            </w:r>
+          </w:p>
+        </w:tc>
+      </w:tr>
+      <w:tr>
+        <w:tc>
+          <w:tcPr>
+            <w:tcW w:type="dxa" w:w="1984"/>
+          </w:tcPr>
+          <w:p>
+            <w:r>
+              <w:rPr>
+                <w:b/>
+                <w:sz w:val="22"/>
+              </w:rPr>
+              <w:t>M:N</w:t>
+            </w:r>
+          </w:p>
+        </w:tc>
+        <w:tc>
+          <w:tcPr>
+            <w:tcW w:type="dxa" w:w="7370"/>
+          </w:tcPr>
+          <w:p>
+            <w:r>
+              <w:rPr>
+                <w:sz w:val="22"/>
+              </w:rPr>
+              <w:t>Many-to-Many (relational cardinality)</w:t>
+            </w:r>
+          </w:p>
+        </w:tc>
+      </w:tr>
+      <w:tr>
+        <w:tc>
+          <w:tcPr>
+            <w:tcW w:type="dxa" w:w="1984"/>
+          </w:tcPr>
+          <w:p>
+            <w:r>
+              <w:rPr>
+                <w:b/>
+                <w:sz w:val="22"/>
+              </w:rPr>
+              <w:t>MoSCoW</w:t>
+            </w:r>
+          </w:p>
+        </w:tc>
+        <w:tc>
+          <w:tcPr>
+            <w:tcW w:type="dxa" w:w="7370"/>
+          </w:tcPr>
+          <w:p>
+            <w:r>
+              <w:rPr>
+                <w:sz w:val="22"/>
+              </w:rPr>
+              <w:t>Must, Should, Could, Won't (requirement priority scale)</w:t>
+            </w:r>
+          </w:p>
+        </w:tc>
+      </w:tr>
+      <w:tr>
+        <w:tc>
+          <w:tcPr>
+            <w:tcW w:type="dxa" w:w="1984"/>
+          </w:tcPr>
+          <w:p>
+            <w:r>
+              <w:rPr>
+                <w:b/>
+                <w:sz w:val="22"/>
+              </w:rPr>
+              <w:t>MP3</w:t>
+            </w:r>
+          </w:p>
+        </w:tc>
+        <w:tc>
+          <w:tcPr>
+            <w:tcW w:type="dxa" w:w="7370"/>
+          </w:tcPr>
+          <w:p>
+            <w:r>
+              <w:rPr>
+                <w:sz w:val="22"/>
+              </w:rPr>
+              <w:t>MPEG Audio Layer III</w:t>
+            </w:r>
+          </w:p>
+        </w:tc>
+      </w:tr>
+      <w:tr>
+        <w:tc>
+          <w:tcPr>
+            <w:tcW w:type="dxa" w:w="1984"/>
+          </w:tcPr>
+          <w:p>
+            <w:r>
+              <w:rPr>
+                <w:b/>
+                <w:sz w:val="22"/>
+              </w:rPr>
+              <w:t>MVC</w:t>
+            </w:r>
+          </w:p>
+        </w:tc>
+        <w:tc>
+          <w:tcPr>
+            <w:tcW w:type="dxa" w:w="7370"/>
+          </w:tcPr>
+          <w:p>
+            <w:r>
+              <w:rPr>
+                <w:sz w:val="22"/>
+              </w:rPr>
+              <w:t>Model-View-Controller</w:t>
+            </w:r>
+          </w:p>
+        </w:tc>
+      </w:tr>
+      <w:tr>
+        <w:tc>
+          <w:tcPr>
+            <w:tcW w:type="dxa" w:w="1984"/>
+          </w:tcPr>
+          <w:p>
+            <w:r>
+              <w:rPr>
+                <w:b/>
+                <w:sz w:val="22"/>
+              </w:rPr>
+              <w:t>NLP</w:t>
+            </w:r>
+          </w:p>
+        </w:tc>
+        <w:tc>
+          <w:tcPr>
+            <w:tcW w:type="dxa" w:w="7370"/>
+          </w:tcPr>
+          <w:p>
+            <w:r>
+              <w:rPr>
+                <w:sz w:val="22"/>
+              </w:rPr>
+              <w:t>Natural Language Processing</w:t>
+            </w:r>
+          </w:p>
+        </w:tc>
+      </w:tr>
+      <w:tr>
+        <w:tc>
+          <w:tcPr>
+            <w:tcW w:type="dxa" w:w="1984"/>
+          </w:tcPr>
+          <w:p>
+            <w:r>
+              <w:rPr>
+                <w:b/>
+                <w:sz w:val="22"/>
+              </w:rPr>
+              <w:t>npm</w:t>
+            </w:r>
+          </w:p>
+        </w:tc>
+        <w:tc>
+          <w:tcPr>
+            <w:tcW w:type="dxa" w:w="7370"/>
+          </w:tcPr>
+          <w:p>
+            <w:r>
+              <w:rPr>
+                <w:sz w:val="22"/>
+              </w:rPr>
+              <w:t>Node Package Manager</w:t>
+            </w:r>
+          </w:p>
+        </w:tc>
+      </w:tr>
+      <w:tr>
+        <w:tc>
+          <w:tcPr>
+            <w:tcW w:type="dxa" w:w="1984"/>
+          </w:tcPr>
+          <w:p>
+            <w:r>
+              <w:rPr>
+                <w:b/>
+                <w:sz w:val="22"/>
+              </w:rPr>
+              <w:t>OOP</w:t>
+            </w:r>
+          </w:p>
+        </w:tc>
+        <w:tc>
+          <w:tcPr>
+            <w:tcW w:type="dxa" w:w="7370"/>
+          </w:tcPr>
+          <w:p>
+            <w:r>
+              <w:rPr>
+                <w:sz w:val="22"/>
+              </w:rPr>
+              <w:t>Object-Oriented Programming</w:t>
+            </w:r>
+          </w:p>
+        </w:tc>
+      </w:tr>
+      <w:tr>
+        <w:tc>
+          <w:tcPr>
+            <w:tcW w:type="dxa" w:w="1984"/>
+          </w:tcPr>
+          <w:p>
+            <w:r>
+              <w:rPr>
+                <w:b/>
+                <w:sz w:val="22"/>
+              </w:rPr>
+              <w:t>ORM</w:t>
+            </w:r>
+          </w:p>
+        </w:tc>
+        <w:tc>
+          <w:tcPr>
+            <w:tcW w:type="dxa" w:w="7370"/>
+          </w:tcPr>
+          <w:p>
+            <w:r>
+              <w:rPr>
+                <w:sz w:val="22"/>
+              </w:rPr>
+              <w:t>Object-Relational Mapping</w:t>
+            </w:r>
+          </w:p>
+        </w:tc>
+      </w:tr>
+      <w:tr>
+        <w:tc>
+          <w:tcPr>
+            <w:tcW w:type="dxa" w:w="1984"/>
+          </w:tcPr>
+          <w:p>
+            <w:r>
+              <w:rPr>
+                <w:b/>
+                <w:sz w:val="22"/>
+              </w:rPr>
+              <w:t>OS</w:t>
+            </w:r>
+          </w:p>
+        </w:tc>
+        <w:tc>
+          <w:tcPr>
+            <w:tcW w:type="dxa" w:w="7370"/>
+          </w:tcPr>
+          <w:p>
+            <w:r>
+              <w:rPr>
+                <w:sz w:val="22"/>
+              </w:rPr>
+              <w:t>Operating System</w:t>
+            </w:r>
+          </w:p>
+        </w:tc>
+      </w:tr>
+      <w:tr>
+        <w:tc>
+          <w:tcPr>
+            <w:tcW w:type="dxa" w:w="1984"/>
+          </w:tcPr>
+          <w:p>
+            <w:r>
+              <w:rPr>
+                <w:b/>
+                <w:sz w:val="22"/>
+              </w:rPr>
+              <w:t>PCM</w:t>
+            </w:r>
+          </w:p>
+        </w:tc>
+        <w:tc>
+          <w:tcPr>
+            <w:tcW w:type="dxa" w:w="7370"/>
+          </w:tcPr>
+          <w:p>
+            <w:r>
+              <w:rPr>
+                <w:sz w:val="22"/>
+              </w:rPr>
+              <w:t>Pulse Code Modulation</w:t>
+            </w:r>
+          </w:p>
+        </w:tc>
+      </w:tr>
+      <w:tr>
+        <w:tc>
+          <w:tcPr>
+            <w:tcW w:type="dxa" w:w="1984"/>
+          </w:tcPr>
+          <w:p>
+            <w:r>
+              <w:rPr>
+                <w:b/>
+                <w:sz w:val="22"/>
+              </w:rPr>
+              <w:t>PDF</w:t>
+            </w:r>
+          </w:p>
+        </w:tc>
+        <w:tc>
+          <w:tcPr>
+            <w:tcW w:type="dxa" w:w="7370"/>
+          </w:tcPr>
+          <w:p>
+            <w:r>
+              <w:rPr>
+                <w:sz w:val="22"/>
+              </w:rPr>
+              <w:t>Portable Document Format</w:t>
+            </w:r>
+          </w:p>
+        </w:tc>
+      </w:tr>
+      <w:tr>
+        <w:tc>
+          <w:tcPr>
+            <w:tcW w:type="dxa" w:w="1984"/>
+          </w:tcPr>
+          <w:p>
+            <w:r>
+              <w:rPr>
+                <w:b/>
+                <w:sz w:val="22"/>
+              </w:rPr>
+              <w:t>PK</w:t>
+            </w:r>
+          </w:p>
+        </w:tc>
+        <w:tc>
+          <w:tcPr>
+            <w:tcW w:type="dxa" w:w="7370"/>
+          </w:tcPr>
+          <w:p>
+            <w:r>
+              <w:rPr>
+                <w:sz w:val="22"/>
+              </w:rPr>
+              <w:t>Primary Key</w:t>
+            </w:r>
+          </w:p>
+        </w:tc>
+      </w:tr>
+      <w:tr>
+        <w:tc>
+          <w:tcPr>
+            <w:tcW w:type="dxa" w:w="1984"/>
+          </w:tcPr>
+          <w:p>
+            <w:r>
+              <w:rPr>
+                <w:b/>
+                <w:sz w:val="22"/>
+              </w:rPr>
+              <w:t>PNG</w:t>
+            </w:r>
+          </w:p>
+        </w:tc>
+        <w:tc>
+          <w:tcPr>
+            <w:tcW w:type="dxa" w:w="7370"/>
+          </w:tcPr>
+          <w:p>
+            <w:r>
+              <w:rPr>
+                <w:sz w:val="22"/>
+              </w:rPr>
+              <w:t>Portable Network Graphics</w:t>
+            </w:r>
+          </w:p>
+        </w:tc>
+      </w:tr>
+      <w:tr>
+        <w:tc>
+          <w:tcPr>
+            <w:tcW w:type="dxa" w:w="1984"/>
+          </w:tcPr>
+          <w:p>
+            <w:r>
+              <w:rPr>
+                <w:b/>
+                <w:sz w:val="22"/>
+              </w:rPr>
+              <w:t>REST</w:t>
+            </w:r>
+          </w:p>
+        </w:tc>
+        <w:tc>
+          <w:tcPr>
+            <w:tcW w:type="dxa" w:w="7370"/>
+          </w:tcPr>
+          <w:p>
+            <w:r>
+              <w:rPr>
+                <w:sz w:val="22"/>
+              </w:rPr>
+              <w:t>Representational State Transfer</w:t>
+            </w:r>
+          </w:p>
+        </w:tc>
+      </w:tr>
+      <w:tr>
+        <w:tc>
+          <w:tcPr>
+            <w:tcW w:type="dxa" w:w="1984"/>
+          </w:tcPr>
+          <w:p>
+            <w:r>
+              <w:rPr>
+                <w:b/>
+                <w:sz w:val="22"/>
+              </w:rPr>
+              <w:t>SDK</w:t>
+            </w:r>
+          </w:p>
+        </w:tc>
+        <w:tc>
+          <w:tcPr>
+            <w:tcW w:type="dxa" w:w="7370"/>
+          </w:tcPr>
+          <w:p>
+            <w:r>
+              <w:rPr>
+                <w:sz w:val="22"/>
+              </w:rPr>
+              <w:t>Software Development Kit</w:t>
+            </w:r>
+          </w:p>
+        </w:tc>
+      </w:tr>
+      <w:tr>
+        <w:tc>
+          <w:tcPr>
+            <w:tcW w:type="dxa" w:w="1984"/>
+          </w:tcPr>
+          <w:p>
+            <w:r>
+              <w:rPr>
+                <w:b/>
+                <w:sz w:val="22"/>
+              </w:rPr>
+              <w:t>SPA</w:t>
+            </w:r>
+          </w:p>
+        </w:tc>
+        <w:tc>
+          <w:tcPr>
+            <w:tcW w:type="dxa" w:w="7370"/>
+          </w:tcPr>
+          <w:p>
+            <w:r>
+              <w:rPr>
+                <w:sz w:val="22"/>
+              </w:rPr>
+              <w:t>Single-Page Application</w:t>
+            </w:r>
+          </w:p>
+        </w:tc>
+      </w:tr>
+      <w:tr>
+        <w:tc>
+          <w:tcPr>
+            <w:tcW w:type="dxa" w:w="1984"/>
+          </w:tcPr>
+          <w:p>
+            <w:r>
+              <w:rPr>
+                <w:b/>
+                <w:sz w:val="22"/>
+              </w:rPr>
+              <w:t>SQL</w:t>
+            </w:r>
+          </w:p>
+        </w:tc>
+        <w:tc>
+          <w:tcPr>
+            <w:tcW w:type="dxa" w:w="7370"/>
+          </w:tcPr>
+          <w:p>
+            <w:r>
+              <w:rPr>
+                <w:sz w:val="22"/>
+              </w:rPr>
+              <w:t>Structured Query Language</w:t>
+            </w:r>
+          </w:p>
+        </w:tc>
+      </w:tr>
+      <w:tr>
+        <w:tc>
+          <w:tcPr>
+            <w:tcW w:type="dxa" w:w="1984"/>
+          </w:tcPr>
+          <w:p>
+            <w:r>
+              <w:rPr>
+                <w:b/>
+                <w:sz w:val="22"/>
+              </w:rPr>
+              <w:t>TS</w:t>
+            </w:r>
+          </w:p>
+        </w:tc>
+        <w:tc>
+          <w:tcPr>
+            <w:tcW w:type="dxa" w:w="7370"/>
+          </w:tcPr>
+          <w:p>
+            <w:r>
+              <w:rPr>
+                <w:sz w:val="22"/>
+              </w:rPr>
+              <w:t>TypeScript</w:t>
+            </w:r>
+          </w:p>
+        </w:tc>
+      </w:tr>
+      <w:tr>
+        <w:tc>
+          <w:tcPr>
+            <w:tcW w:type="dxa" w:w="1984"/>
+          </w:tcPr>
+          <w:p>
+            <w:r>
+              <w:rPr>
+                <w:b/>
+                <w:sz w:val="22"/>
+              </w:rPr>
+              <w:t>TTS</w:t>
+            </w:r>
+          </w:p>
+        </w:tc>
+        <w:tc>
+          <w:tcPr>
+            <w:tcW w:type="dxa" w:w="7370"/>
+          </w:tcPr>
+          <w:p>
+            <w:r>
+              <w:rPr>
+                <w:sz w:val="22"/>
+              </w:rPr>
+              <w:t>Text-to-Speech</w:t>
+            </w:r>
+          </w:p>
+        </w:tc>
+      </w:tr>
+      <w:tr>
+        <w:tc>
+          <w:tcPr>
+            <w:tcW w:type="dxa" w:w="1984"/>
+          </w:tcPr>
+          <w:p>
+            <w:r>
+              <w:rPr>
+                <w:b/>
+                <w:sz w:val="22"/>
+              </w:rPr>
+              <w:t>UC</w:t>
+            </w:r>
+          </w:p>
+        </w:tc>
+        <w:tc>
+          <w:tcPr>
+            <w:tcW w:type="dxa" w:w="7370"/>
+          </w:tcPr>
+          <w:p>
+            <w:r>
+              <w:rPr>
+                <w:sz w:val="22"/>
+              </w:rPr>
+              <w:t>Use Case</w:t>
+            </w:r>
+          </w:p>
+        </w:tc>
+      </w:tr>
+      <w:tr>
+        <w:tc>
+          <w:tcPr>
+            <w:tcW w:type="dxa" w:w="1984"/>
+          </w:tcPr>
+          <w:p>
+            <w:r>
+              <w:rPr>
+                <w:b/>
+                <w:sz w:val="22"/>
+              </w:rPr>
+              <w:t>UI</w:t>
+            </w:r>
+          </w:p>
+        </w:tc>
+        <w:tc>
+          <w:tcPr>
+            <w:tcW w:type="dxa" w:w="7370"/>
+          </w:tcPr>
+          <w:p>
+            <w:r>
+              <w:rPr>
+                <w:sz w:val="22"/>
+              </w:rPr>
+              <w:t>User Interface</w:t>
+            </w:r>
+          </w:p>
+        </w:tc>
+      </w:tr>
+      <w:tr>
+        <w:tc>
+          <w:tcPr>
+            <w:tcW w:type="dxa" w:w="1984"/>
+          </w:tcPr>
+          <w:p>
+            <w:r>
+              <w:rPr>
+                <w:b/>
+                <w:sz w:val="22"/>
+              </w:rPr>
+              <w:t>UML</w:t>
+            </w:r>
+          </w:p>
+        </w:tc>
+        <w:tc>
+          <w:tcPr>
+            <w:tcW w:type="dxa" w:w="7370"/>
+          </w:tcPr>
+          <w:p>
+            <w:r>
+              <w:rPr>
+                <w:sz w:val="22"/>
+              </w:rPr>
+              <w:t>Unified Modeling Language</w:t>
+            </w:r>
+          </w:p>
+        </w:tc>
+      </w:tr>
+      <w:tr>
+        <w:tc>
+          <w:tcPr>
+            <w:tcW w:type="dxa" w:w="1984"/>
+          </w:tcPr>
+          <w:p>
+            <w:r>
+              <w:rPr>
+                <w:b/>
+                <w:sz w:val="22"/>
+              </w:rPr>
+              <w:t>URL</w:t>
+            </w:r>
+          </w:p>
+        </w:tc>
+        <w:tc>
+          <w:tcPr>
+            <w:tcW w:type="dxa" w:w="7370"/>
+          </w:tcPr>
+          <w:p>
+            <w:r>
+              <w:rPr>
+                <w:sz w:val="22"/>
+              </w:rPr>
+              <w:t>Uniform Resource Locator</w:t>
+            </w:r>
+          </w:p>
+        </w:tc>
+      </w:tr>
+      <w:tr>
+        <w:tc>
+          <w:tcPr>
+            <w:tcW w:type="dxa" w:w="1984"/>
+          </w:tcPr>
+          <w:p>
+            <w:r>
+              <w:rPr>
+                <w:b/>
+                <w:sz w:val="22"/>
+              </w:rPr>
+              <w:t>UX</w:t>
+            </w:r>
+          </w:p>
+        </w:tc>
+        <w:tc>
+          <w:tcPr>
+            <w:tcW w:type="dxa" w:w="7370"/>
+          </w:tcPr>
+          <w:p>
+            <w:r>
+              <w:rPr>
+                <w:sz w:val="22"/>
+              </w:rPr>
+              <w:t>User Experience</w:t>
+            </w:r>
+          </w:p>
+        </w:tc>
+      </w:tr>
+      <w:tr>
+        <w:tc>
+          <w:tcPr>
+            <w:tcW w:type="dxa" w:w="1984"/>
+          </w:tcPr>
+          <w:p>
+            <w:r>
+              <w:rPr>
+                <w:b/>
+                <w:sz w:val="22"/>
+              </w:rPr>
+              <w:t>venv</w:t>
+            </w:r>
+          </w:p>
+        </w:tc>
+        <w:tc>
+          <w:tcPr>
+            <w:tcW w:type="dxa" w:w="7370"/>
+          </w:tcPr>
+          <w:p>
+            <w:r>
+              <w:rPr>
+                <w:sz w:val="22"/>
+              </w:rPr>
+              <w:t>Virtual Environment (Python)</w:t>
+            </w:r>
+          </w:p>
+        </w:tc>
+      </w:tr>
+      <w:tr>
+        <w:tc>
+          <w:tcPr>
+            <w:tcW w:type="dxa" w:w="1984"/>
+          </w:tcPr>
+          <w:p>
+            <w:r>
+              <w:rPr>
+                <w:b/>
+                <w:sz w:val="22"/>
+              </w:rPr>
+              <w:t>WAV</w:t>
+            </w:r>
+          </w:p>
+        </w:tc>
+        <w:tc>
+          <w:tcPr>
+            <w:tcW w:type="dxa" w:w="7370"/>
+          </w:tcPr>
+          <w:p>
+            <w:r>
+              <w:rPr>
+                <w:sz w:val="22"/>
+              </w:rPr>
+              <w:t>Waveform Audio File Format</w:t>
+            </w:r>
+          </w:p>
+        </w:tc>
+      </w:tr>
+      <w:tr>
+        <w:tc>
+          <w:tcPr>
+            <w:tcW w:type="dxa" w:w="1984"/>
+          </w:tcPr>
+          <w:p>
+            <w:r>
+              <w:rPr>
+                <w:b/>
+                <w:sz w:val="22"/>
+              </w:rPr>
+              <w:t>XML</w:t>
+            </w:r>
+          </w:p>
+        </w:tc>
+        <w:tc>
+          <w:tcPr>
+            <w:tcW w:type="dxa" w:w="7370"/>
+          </w:tcPr>
+          <w:p>
+            <w:r>
+              <w:rPr>
+                <w:sz w:val="22"/>
+              </w:rPr>
+              <w:t>eXtensible Markup Language</w:t>
+            </w:r>
+          </w:p>
+        </w:tc>
+      </w:tr>
+    </w:tbl>
     <w:sectPr>
       <w:headerReference w:type="default" r:id="rId9"/>
       <w:footerReference w:type="default" r:id="rId10"/>

</xml_diff>

<commit_message>
rescriere link uri in md
</commit_message>
<xml_diff>
--- a/docs/Pulsefy_Diploma_Thesis.docx
+++ b/docs/Pulsefy_Diploma_Thesis.docx
@@ -1051,7 +1051,7 @@
         <w:rPr>
           <w:sz w:val="22"/>
         </w:rPr>
-        <w:t>Short-form vertical video has become the dominant format for social-media advertising. TikTok, Instagram Reels, and YouTube Shorts each report user audiences in the hundreds of millions, with watch sessions composed of dozens of clips per sitting. Brands and creators that need to reach those audiences are concentrating their advertising effort on this format because it matches where viewer attention has moved.</w:t>
+        <w:t>Short-form vertical video has become the dominant format for social-media advertising. TikTok, Instagram Reels, and YouTube Shorts each report user audiences in the hundreds of millions. eMarketer estimated TikTok's monthly active users at approximately 955 million for 2025, building from the one billion mark ByteDance officially announced in September 2021. Brands and creators that need to reach those audiences are concentrating their advertising effort on this format because it matches where viewer attention has moved.</w:t>
       </w:r>
       <w:r>
         <w:rPr>
@@ -1059,7 +1059,7 @@
           <w:color w:val="C0392B"/>
           <w:sz w:val="20"/>
         </w:rPr>
-        <w:t xml:space="preserve">  [footnote F1: TikTok / Meta active user figures and short-form ad engagement — see THESIS_RESEARCH_BANK.md Section A; verify and add Word footnote here]</w:t>
+        <w:t xml:space="preserve">  [footnote F1: TikTok MAU per eMarketer (via Statista, 2025); ByteDance official 1 B announcement (Sept 2021). URL: https://www.statista.com/statistics/1327116/number-of-global-tiktok-users/ — add Word footnote here]</w:t>
       </w:r>
     </w:p>
     <w:p>
@@ -1071,7 +1071,7 @@
         <w:rPr>
           <w:sz w:val="22"/>
         </w:rPr>
-        <w:t>The advertising spend has followed the attention. Global digital advertising revenue continues to grow year on year, with social-media platforms taking a steadily larger share, and short-form video has been the fastest-growing single format on those platforms.</w:t>
+        <w:t>The advertising spend has followed the attention. WARC's September 2025 global forecast estimated worldwide ad spending at 1.17 trillion US dollars in 2025, a 7.4 percent year-on-year increase, with social media accounting for 26.2 percent of the total at 306.4 billion dollars and growing 14.9 percent year on year. Social platforms now capture the majority of incremental ad dollars, and short-form video is among the fastest-growing single formats inside that share.</w:t>
       </w:r>
       <w:r>
         <w:rPr>
@@ -1079,7 +1079,7 @@
           <w:color w:val="C0392B"/>
           <w:sz w:val="20"/>
         </w:rPr>
-        <w:t xml:space="preserve">  [footnote F2: digital ad spend trend — cite eMarketer / WARC / IFPI for comparable music-industry digital share if helpful; add Word footnote]</w:t>
+        <w:t xml:space="preserve">  [footnote F2: WARC Global Ad Spend forecast Sept 2025 via eMarketer. URL: https://www.emarketer.com/content/global-ad-spending-now-estimated-rise-7-4--warc-s-first-positive-revision-over-year — add Word footnote here]</w:t>
       </w:r>
     </w:p>
     <w:p>
@@ -1251,7 +1251,7 @@
         <w:rPr>
           <w:sz w:val="22"/>
         </w:rPr>
-        <w:t>The cost gap between what small advertisers need and what is available to them has two layers. The first is the absolute cost of creative-agency work, which still ranges from one to ten thousand euros per campaign for the kind of small project a side-hustle creator might commission. For a retailer with a few hundred euros in monthly ad budget, this is unaffordable as a recurring expense.</w:t>
+        <w:t>The cost gap between what small advertisers need and what is available to them has two layers. The first is the absolute cost of creative-agency work, which typically runs into the thousands of euros per campaign for the kind of small project a side-hustle creator might commission. Romanian and broader Eastern European agencies generally bill at lower hourly rates than Western European or North American studios, but a single short-form ad campaign still represents a recurring expense that a retailer with a few hundred euros in monthly ad budget cannot absorb.</w:t>
       </w:r>
       <w:r>
         <w:rPr>
@@ -1259,7 +1259,7 @@
           <w:color w:val="C0392B"/>
           <w:sz w:val="20"/>
         </w:rPr>
-        <w:t xml:space="preserve">  [footnote F3: agency price range — cite a Romanian or European agency rate card; add Word footnote here]</w:t>
+        <w:t xml:space="preserve">  [footnote F3: Romanian agency hourly rates and campaign-cost range — verify via Sortlist Romania directory (https://www.sortlist.com/advertising/romania-ro) and Clutch.co agency directory; the specific euro range was softened on 2026-05-07 because no single authoritative source publishes it]</w:t>
       </w:r>
     </w:p>
     <w:p>
@@ -1271,7 +1271,7 @@
         <w:rPr>
           <w:sz w:val="22"/>
         </w:rPr>
-        <w:t>The second layer is the subscription cost of professional production software. Adobe Creative Cloud, the industry-standard package for design, image editing, and video, costs around sixty euros per month. Final Cut Pro, DaVinci Resolve Studio, Logic Pro, and similar professional tools each carry one-time or subscription fees, on top of which most have steep learning curves measured in months rather than days. The total stack is unattractive for someone producing a handful of ads per month.</w:t>
+        <w:t>The second layer is the subscription cost of professional production software. Adobe Creative Cloud, the industry-standard package for design, image editing, and video, is offered as the Creative Cloud Pro plan (the successor to the previous All Apps tier introduced in August 2025) at 69.99 US dollars per month for individual users, with regional pricing in euro and Romanian leu published on Adobe's national pages. Final Cut Pro, DaVinci Resolve Studio, Logic Pro, and similar professional tools each carry one-time or subscription fees, on top of which most have steep learning curves measured in months rather than days. The total stack is unattractive for someone producing a handful of ads per month.</w:t>
       </w:r>
       <w:r>
         <w:rPr>
@@ -1279,7 +1279,7 @@
           <w:color w:val="C0392B"/>
           <w:sz w:val="20"/>
         </w:rPr>
-        <w:t xml:space="preserve">  [footnote F4: Adobe Creative Cloud monthly price — cite official Adobe pricing page; add Word footnote here]</w:t>
+        <w:t xml:space="preserve">  [footnote F4: Adobe Creative Cloud Pro pricing — adobe.com/creativecloud/pro.html (USD); fetch adobe.com/ro/creativecloud/plans.html for the current RON price before final submission]</w:t>
       </w:r>
     </w:p>
     <w:p>

</xml_diff>